<commit_message>
Decisions log: ITL2 2021 version for initial analysis, manual downloads (Price Paid, ONSPD, CHD), education, rurality/density, migration, job flows
Co-Authored-By: Claude Opus 5.5 <noreply@anthropic.com>
</commit_message>
<xml_diff>
--- a/docs/Decisions_Log.docx
+++ b/docs/Decisions_Log.docx
@@ -172,6 +172,62 @@
         </w:numPr>
         <w:spacing w:after="80"/>
       </w:pPr>
+      <w:r>
+        <w:rPr>
+          <w:rFonts w:ascii="Calibri" w:eastAsia="Calibri" w:hAnsi="Calibri" w:cs="Calibri"/>
+          <w:b/>
+          <w:bCs/>
+          <w:sz w:val="21"/>
+          <w:szCs w:val="21"/>
+        </w:rPr>
+        <w:t xml:space="preserve">ITL2 2021 version for initial analysis: </w:t>
+      </w:r>
+      <w:r>
+        <w:rPr>
+          <w:rFonts w:ascii="Calibri" w:eastAsia="Calibri" w:hAnsi="Calibri" w:cs="Calibri"/>
+          <w:sz w:val="21"/>
+          <w:szCs w:val="21"/>
+        </w:rPr>
+        <w:t xml:space="preserve">the secure job-flows data is currently on ITL2 2021 (41 regions); re-aggregating it to 2025 needs secure access. So key indicators are also built on 2021 boundaries, in clean/itl2_2021/ with the same file names. 30 regions are identical on both maps (~74% of UK population); 16 of the 2025 regions (25.5%) differ — North East, East Anglia, South West, Wales, Scotland. The 2025 panel remains the main panel.</w:t>
+      </w:r>
+    </w:p>
+    <w:p>
+      <w:pPr>
+        <w:pStyle w:val="ListParagraph"/>
+        <w:numPr>
+          <w:ilvl w:val="0"/>
+          <w:numId w:val="1"/>
+        </w:numPr>
+        <w:spacing w:after="80"/>
+      </w:pPr>
+      <w:r>
+        <w:rPr>
+          <w:rFonts w:ascii="Calibri" w:eastAsia="Calibri" w:hAnsi="Calibri" w:cs="Calibri"/>
+          <w:b/>
+          <w:bCs/>
+          <w:sz w:val="21"/>
+          <w:szCs w:val="21"/>
+        </w:rPr>
+        <w:t xml:space="preserve">2021 spine: </w:t>
+      </w:r>
+      <w:r>
+        <w:rPr>
+          <w:rFonts w:ascii="Calibri" w:eastAsia="Calibri" w:hAnsi="Calibri" w:cs="Calibri"/>
+          <w:sz w:val="21"/>
+          <w:szCs w:val="21"/>
+        </w:rPr>
+        <w:t xml:space="preserve">build/geography_2021.py, from the ONS LAD (April 2023) → ITL (January 2021) lookup; same rules (one row per LA; North Ayrshire → TLM9, Argyll &amp; Bute → TLM6, by majority of residents). Built on 2021 boundaries: age, productivity, rurality, population density, population-weighted density, migration. LA-based indicators are exact; productivity uses ONS’s published ITL2 values for the 31 unchanged regions and rebuilds the 10 changed ones from ITL3 (Mid Wales split by 16–64 population).</w:t>
+      </w:r>
+    </w:p>
+    <w:p>
+      <w:pPr>
+        <w:pStyle w:val="ListParagraph"/>
+        <w:numPr>
+          <w:ilvl w:val="0"/>
+          <w:numId w:val="1"/>
+        </w:numPr>
+        <w:spacing w:after="80"/>
+      </w:pPr>
       <w:commentRangeStart w:id="0"/>
       <w:r>
         <w:rPr>
@@ -1064,7 +1120,6 @@
           <w:sz w:val="21"/>
           <w:szCs w:val="21"/>
         </w:rPr>
-        <w:lastRenderedPageBreak/>
         <w:t xml:space="preserve">On API now: </w:t>
       </w:r>
       <w:r>
@@ -1073,7 +1128,7 @@
           <w:sz w:val="21"/>
           <w:szCs w:val="21"/>
         </w:rPr>
-        <w:t>population, age, labour, ASHE earnings (Nomis).</w:t>
+        <w:t xml:space="preserve">population, age, labour, education, ASHE earnings, small-area population (Nomis).</w:t>
       </w:r>
     </w:p>
     <w:p>
@@ -1177,15 +1232,127 @@
           <w:sz w:val="21"/>
           <w:szCs w:val="21"/>
         </w:rPr>
-        <w:t xml:space="preserve">Storage: </w:t>
-      </w:r>
-      <w:r>
-        <w:rPr>
-          <w:rFonts w:ascii="Calibri" w:eastAsia="Calibri" w:hAnsi="Calibri" w:cs="Calibri"/>
-          <w:sz w:val="21"/>
-          <w:szCs w:val="21"/>
-        </w:rPr>
-        <w:t>large raw files (Price Paid, ONSPD) are git-ignored and NOT put on SharePoint — they are openly re-downloadable; share small raw files plus a manifest of where to get the big ones. Secure BSD data must never leave the UK Data Service enclave.</w:t>
+        <w:t xml:space="preserve">Raw files in git: </w:t>
+      </w:r>
+      <w:r>
+        <w:rPr>
+          <w:rFonts w:ascii="Calibri" w:eastAsia="Calibri" w:hAnsi="Calibri" w:cs="Calibri"/>
+          <w:sz w:val="21"/>
+          <w:szCs w:val="21"/>
+        </w:rPr>
+        <w:t xml:space="preserve">hand-downloaded source files the build reads from disk are committed (allow-list in .gitignore). Not committed: dated API extracts (nomis_*.csv, re-pulled every run), files the notebooks download themselves, and very large files. Secure LBD data must never leave the UK Data Service enclave.</w:t>
+      </w:r>
+    </w:p>
+    <w:p>
+      <w:pPr>
+        <w:pStyle w:val="ListParagraph"/>
+        <w:numPr>
+          <w:ilvl w:val="0"/>
+          <w:numId w:val="1"/>
+        </w:numPr>
+        <w:spacing w:after="80"/>
+      </w:pPr>
+      <w:r>
+        <w:rPr>
+          <w:rFonts w:ascii="Calibri" w:eastAsia="Calibri" w:hAnsi="Calibri" w:cs="Calibri"/>
+          <w:b/>
+          <w:bCs/>
+          <w:sz w:val="21"/>
+          <w:szCs w:val="21"/>
+        </w:rPr>
+        <w:t xml:space="preserve">Download manually (too large for git): </w:t>
+      </w:r>
+      <w:r>
+        <w:rPr>
+          <w:rFonts w:ascii="Calibri" w:eastAsia="Calibri" w:hAnsi="Calibri" w:cs="Calibri"/>
+          <w:sz w:val="21"/>
+          <w:szCs w:val="21"/>
+        </w:rPr>
+        <w:t xml:space="preserve"/>
+      </w:r>
+    </w:p>
+    <w:p>
+      <w:pPr>
+        <w:pStyle w:val="ListParagraph"/>
+        <w:numPr>
+          <w:ilvl w:val="1"/>
+          <w:numId w:val="1"/>
+        </w:numPr>
+        <w:spacing w:after="60"/>
+      </w:pPr>
+      <w:r>
+        <w:rPr>
+          <w:rFonts w:ascii="Calibri" w:eastAsia="Calibri" w:hAnsi="Calibri" w:cs="Calibri"/>
+          <w:b/>
+          <w:bCs/>
+          <w:sz w:val="21"/>
+          <w:szCs w:val="21"/>
+        </w:rPr>
+        <w:t xml:space="preserve">Price Paid: </w:t>
+      </w:r>
+      <w:r>
+        <w:rPr>
+          <w:rFonts w:ascii="Calibri" w:eastAsia="Calibri" w:hAnsi="Calibri" w:cs="Calibri"/>
+          <w:sz w:val="21"/>
+          <w:szCs w:val="21"/>
+        </w:rPr>
+        <w:t xml:space="preserve">HM Land Registry Price Paid Data — complete file pp-complete.csv (~5.5 GB) and yearly files pp-YYYY.csv — from https://www.gov.uk/government/statistical-data-sets/price-paid-data-downloads, into raw/housing/price_paid/.</w:t>
+      </w:r>
+    </w:p>
+    <w:p>
+      <w:pPr>
+        <w:pStyle w:val="ListParagraph"/>
+        <w:numPr>
+          <w:ilvl w:val="1"/>
+          <w:numId w:val="1"/>
+        </w:numPr>
+        <w:spacing w:after="60"/>
+      </w:pPr>
+      <w:r>
+        <w:rPr>
+          <w:rFonts w:ascii="Calibri" w:eastAsia="Calibri" w:hAnsi="Calibri" w:cs="Calibri"/>
+          <w:b/>
+          <w:bCs/>
+          <w:sz w:val="21"/>
+          <w:szCs w:val="21"/>
+        </w:rPr>
+        <w:t xml:space="preserve">ONSPD: </w:t>
+      </w:r>
+      <w:r>
+        <w:rPr>
+          <w:rFonts w:ascii="Calibri" w:eastAsia="Calibri" w:hAnsi="Calibri" w:cs="Calibri"/>
+          <w:sz w:val="21"/>
+          <w:szCs w:val="21"/>
+        </w:rPr>
+        <w:t xml:space="preserve">needed to map Price Paid postcodes to LAs — ONS Postcode Directory (February 2026, ~1.4 GB), https://geoportal.statistics.gov.uk/datasets/3080229224424c9cb53c0b48f5a64d27, into raw/onspd/.</w:t>
+      </w:r>
+    </w:p>
+    <w:p>
+      <w:pPr>
+        <w:pStyle w:val="ListParagraph"/>
+        <w:numPr>
+          <w:ilvl w:val="1"/>
+          <w:numId w:val="1"/>
+        </w:numPr>
+        <w:spacing w:after="60"/>
+      </w:pPr>
+      <w:r>
+        <w:rPr>
+          <w:rFonts w:ascii="Calibri" w:eastAsia="Calibri" w:hAnsi="Calibri" w:cs="Calibri"/>
+          <w:b/>
+          <w:bCs/>
+          <w:sz w:val="21"/>
+          <w:szCs w:val="21"/>
+        </w:rPr>
+        <w:t xml:space="preserve">Code History Database: </w:t>
+      </w:r>
+      <w:r>
+        <w:rPr>
+          <w:rFonts w:ascii="Calibri" w:eastAsia="Calibri" w:hAnsi="Calibri" w:cs="Calibri"/>
+          <w:sz w:val="21"/>
+          <w:szCs w:val="21"/>
+        </w:rPr>
+        <w:t xml:space="preserve">only to rebuild the LA crosswalk (the crosswalk itself is in git) — https://geoportal.statistics.gov.uk/datasets/e0bc41722b1a4b76a6ecfff14f91cbb4, into raw/geography/.</w:t>
       </w:r>
     </w:p>
     <w:p>
@@ -1370,28 +1537,76 @@
       <w:r>
         <w:rPr>
           <w:rFonts w:ascii="Calibri" w:eastAsia="Calibri" w:hAnsi="Calibri" w:cs="Calibri"/>
-          <w:sz w:val="21"/>
-          <w:szCs w:val="21"/>
-        </w:rPr>
-        <w:t xml:space="preserve">ONS Internal migration in England and Wales (T1a/T1 tables); net = inflow − outflow, counts summed to ITL2. </w:t>
-      </w:r>
-      <w:r>
-        <w:rPr>
-          <w:rFonts w:ascii="Calibri" w:eastAsia="Calibri" w:hAnsi="Calibri" w:cs="Calibri"/>
-          <w:b/>
-          <w:bCs/>
-          <w:sz w:val="21"/>
-          <w:szCs w:val="21"/>
-        </w:rPr>
-        <w:t xml:space="preserve">England &amp; Wales only (39/46 regions; Scotland/NI blank). </w:t>
-      </w:r>
-      <w:r>
-        <w:rPr>
-          <w:rFonts w:ascii="Calibri" w:eastAsia="Calibri" w:hAnsi="Calibri" w:cs="Calibri"/>
-          <w:sz w:val="21"/>
-          <w:szCs w:val="21"/>
-        </w:rPr>
-        <w:t>2012–2025 — the binding series setting the panel window.</w:t>
+          <w:b/>
+          <w:bCs/>
+          <w:sz w:val="21"/>
+          <w:szCs w:val="21"/>
+        </w:rPr>
+        <w:t xml:space="preserve">Sources: </w:t>
+      </w:r>
+      <w:r>
+        <w:rPr>
+          <w:rFonts w:ascii="Calibri" w:eastAsia="Calibri" w:hAnsi="Calibri" w:cs="Calibri"/>
+          <w:sz w:val="21"/>
+          <w:szCs w:val="21"/>
+        </w:rPr>
+        <w:t xml:space="preserve">E&amp;W — ONS internal migration tables (T1/T1a LA in/out; T2/T2a LA × LA origin–destination matrix), 2012–2025. NI (TLN0) — the same ONS matrix (NI ↔ every E&amp;W LA and ↔ Scotland; NI is one ITL2, so complete). Scotland — NRS council × council flows and council ↔ rest-of-UK flows, 2012–2024. All 46 regions 2012–2024 (2025: E&amp;W and NI only).</w:t>
+      </w:r>
+    </w:p>
+    <w:p>
+      <w:pPr>
+        <w:pStyle w:val="ListParagraph"/>
+        <w:numPr>
+          <w:ilvl w:val="0"/>
+          <w:numId w:val="1"/>
+        </w:numPr>
+        <w:spacing w:after="80"/>
+      </w:pPr>
+      <w:r>
+        <w:rPr>
+          <w:rFonts w:ascii="Calibri" w:eastAsia="Calibri" w:hAnsi="Calibri" w:cs="Calibri"/>
+          <w:b/>
+          <w:bCs/>
+          <w:sz w:val="21"/>
+          <w:szCs w:val="21"/>
+        </w:rPr>
+        <w:t xml:space="preserve">Gross flows: </w:t>
+      </w:r>
+      <w:r>
+        <w:rPr>
+          <w:rFonts w:ascii="Calibri" w:eastAsia="Calibri" w:hAnsi="Calibri" w:cs="Calibri"/>
+          <w:sz w:val="21"/>
+          <w:szCs w:val="21"/>
+        </w:rPr>
+        <w:t xml:space="preserve">LA-summed inflow/outflow include moves between LAs inside the same ITL2 (median 30%, up to 46% of “inflow”). True ITL2 gross flows (inflow_itl2, outflow_itl2) come from the origin–destination matrix — use these for mobility rates; net migration is unaffected. Region × region flows in migration_flows_itl2.csv; flows between a specific Scottish region and a specific E&amp;W region are not published (kept as one Scotland block).</w:t>
+      </w:r>
+    </w:p>
+    <w:p>
+      <w:pPr>
+        <w:pStyle w:val="ListParagraph"/>
+        <w:numPr>
+          <w:ilvl w:val="0"/>
+          <w:numId w:val="1"/>
+        </w:numPr>
+        <w:spacing w:after="80"/>
+      </w:pPr>
+      <w:r>
+        <w:rPr>
+          <w:rFonts w:ascii="Calibri" w:eastAsia="Calibri" w:hAnsi="Calibri" w:cs="Calibri"/>
+          <w:b/>
+          <w:bCs/>
+          <w:sz w:val="21"/>
+          <w:szCs w:val="21"/>
+        </w:rPr>
+        <w:t xml:space="preserve">Robustness: </w:t>
+      </w:r>
+      <w:r>
+        <w:rPr>
+          <w:rFonts w:ascii="Calibri" w:eastAsia="Calibri" w:hAnsi="Calibri" w:cs="Calibri"/>
+          <w:sz w:val="21"/>
+          <w:szCs w:val="21"/>
+        </w:rPr>
+        <w:t xml:space="preserve">matrix margins reproduce the LA tables; aggregated flows match ONS’s own region matrix (T6) in all years (median gap 6 moves, ≤1.6%, cell rounding); NRS and ONS Scotland ↔ rest-of-UK totals agree within 0.1%. ONS misnamed the 2019 region sheet (IMI2019-T6) — handled.</w:t>
       </w:r>
     </w:p>
     <w:p>
@@ -1606,6 +1821,34 @@
     </w:p>
     <w:p>
       <w:pPr>
+        <w:pStyle w:val="ListParagraph"/>
+        <w:numPr>
+          <w:ilvl w:val="0"/>
+          <w:numId w:val="1"/>
+        </w:numPr>
+        <w:spacing w:after="80"/>
+      </w:pPr>
+      <w:r>
+        <w:rPr>
+          <w:rFonts w:ascii="Calibri" w:eastAsia="Calibri" w:hAnsi="Calibri" w:cs="Calibri"/>
+          <w:b/>
+          <w:bCs/>
+          <w:sz w:val="21"/>
+          <w:szCs w:val="21"/>
+        </w:rPr>
+        <w:t xml:space="preserve">2021 boundaries: </w:t>
+      </w:r>
+      <w:r>
+        <w:rPr>
+          <w:rFonts w:ascii="Calibri" w:eastAsia="Calibri" w:hAnsi="Calibri" w:cs="Calibri"/>
+          <w:sz w:val="21"/>
+          <w:szCs w:val="21"/>
+        </w:rPr>
+        <w:t xml:space="preserve">see Section 1 — published values for 31 regions, ITL3 rebuild for 10; jobs and £ exact, real values within ~0.2% (median).</w:t>
+      </w:r>
+    </w:p>
+    <w:p>
+      <w:pPr>
         <w:pStyle w:val="Heading2"/>
         <w:spacing w:before="170" w:after="60"/>
       </w:pPr>
@@ -2317,6 +2560,281 @@
     </w:p>
     <w:p>
       <w:pPr>
+        <w:pStyle w:val="Heading2"/>
+        <w:spacing w:before="170" w:after="60"/>
+      </w:pPr>
+      <w:r>
+        <w:rPr>
+          <w:rFonts w:ascii="Calibri" w:eastAsia="Calibri" w:hAnsi="Calibri" w:cs="Calibri"/>
+          <w:b/>
+          <w:bCs/>
+          <w:color w:val="2E5496"/>
+          <w:sz w:val="22"/>
+          <w:szCs w:val="22"/>
+        </w:rPr>
+        <w:t xml:space="preserve">Educational attainment</w:t>
+      </w:r>
+    </w:p>
+    <w:p>
+      <w:pPr>
+        <w:pStyle w:val="ListParagraph"/>
+        <w:numPr>
+          <w:ilvl w:val="0"/>
+          <w:numId w:val="1"/>
+        </w:numPr>
+        <w:spacing w:after="80"/>
+      </w:pPr>
+      <w:r>
+        <w:rPr>
+          <w:rFonts w:ascii="Calibri" w:eastAsia="Calibri" w:hAnsi="Calibri" w:cs="Calibri"/>
+          <w:b/>
+          <w:bCs/>
+          <w:sz w:val="21"/>
+          <w:szCs w:val="21"/>
+        </w:rPr>
+        <w:t xml:space="preserve">Source: </w:t>
+      </w:r>
+      <w:r>
+        <w:rPr>
+          <w:rFonts w:ascii="Calibri" w:eastAsia="Calibri" w:hAnsi="Calibri" w:cs="Calibri"/>
+          <w:sz w:val="21"/>
+          <w:szCs w:val="21"/>
+        </w:rPr>
+        <w:t xml:space="preserve">APS (Nomis NM_17_5) numerators/denominators — people aged 16–64 with level 4+, 3+ and 2+, 2004–2025; same pipeline as the labour market (LA → ITL2 sums; NI country figure). “Below level 2” = population − level 2+ (avoids the heavily suppressed “no qualifications”).</w:t>
+      </w:r>
+    </w:p>
+    <w:p>
+      <w:pPr>
+        <w:pStyle w:val="ListParagraph"/>
+        <w:numPr>
+          <w:ilvl w:val="0"/>
+          <w:numId w:val="1"/>
+        </w:numPr>
+        <w:spacing w:after="80"/>
+      </w:pPr>
+      <w:r>
+        <w:rPr>
+          <w:rFonts w:ascii="Calibri" w:eastAsia="Calibri" w:hAnsi="Calibri" w:cs="Calibri"/>
+          <w:b/>
+          <w:bCs/>
+          <w:sz w:val="21"/>
+          <w:szCs w:val="21"/>
+        </w:rPr>
+        <w:t xml:space="preserve">Break: </w:t>
+      </w:r>
+      <w:r>
+        <w:rPr>
+          <w:rFonts w:ascii="Calibri" w:eastAsia="Calibri" w:hAnsi="Calibri" w:cs="Calibri"/>
+          <w:sz w:val="21"/>
+          <w:szCs w:val="21"/>
+        </w:rPr>
+        <w:t xml:space="preserve">NVQ (2004–21) → RQF (2022+), no overlap year; not spliced (qual_framework column). Level 4+ near-continuous; level 3+ jumps ~5 points nationally. Regional spread of the 2022 jump (sd 2.6 pts) exceeds normal noise (1.8) — robustness: region × post-2022 effects, or 2004–21 only.</w:t>
+      </w:r>
+    </w:p>
+    <w:p>
+      <w:pPr>
+        <w:pStyle w:val="ListParagraph"/>
+        <w:numPr>
+          <w:ilvl w:val="0"/>
+          <w:numId w:val="1"/>
+        </w:numPr>
+        <w:spacing w:after="80"/>
+      </w:pPr>
+      <w:r>
+        <w:rPr>
+          <w:rFonts w:ascii="Calibri" w:eastAsia="Calibri" w:hAnsi="Calibri" w:cs="Calibri"/>
+          <w:b/>
+          <w:bCs/>
+          <w:sz w:val="21"/>
+          <w:szCs w:val="21"/>
+        </w:rPr>
+        <w:t xml:space="preserve">Census check: </w:t>
+      </w:r>
+      <w:r>
+        <w:rPr>
+          <w:rFonts w:ascii="Calibri" w:eastAsia="Calibri" w:hAnsi="Calibri" w:cs="Calibri"/>
+          <w:sz w:val="21"/>
+          <w:szCs w:val="21"/>
+        </w:rPr>
+        <w:t xml:space="preserve">Census 2001/2011/2021 level 4+ shares correlate 0.92–0.98 with APS across regions; 2011–21 changes 0.62 (APS noisier). Output: education_census_itl2.csv.</w:t>
+      </w:r>
+    </w:p>
+    <w:p>
+      <w:pPr>
+        <w:pStyle w:val="Heading2"/>
+        <w:spacing w:before="170" w:after="60"/>
+      </w:pPr>
+      <w:r>
+        <w:rPr>
+          <w:rFonts w:ascii="Calibri" w:eastAsia="Calibri" w:hAnsi="Calibri" w:cs="Calibri"/>
+          <w:b/>
+          <w:bCs/>
+          <w:color w:val="2E5496"/>
+          <w:sz w:val="22"/>
+          <w:szCs w:val="22"/>
+        </w:rPr>
+        <w:t xml:space="preserve">Rurality &amp; population density</w:t>
+      </w:r>
+    </w:p>
+    <w:p>
+      <w:pPr>
+        <w:pStyle w:val="ListParagraph"/>
+        <w:numPr>
+          <w:ilvl w:val="0"/>
+          <w:numId w:val="1"/>
+        </w:numPr>
+        <w:spacing w:after="80"/>
+      </w:pPr>
+      <w:r>
+        <w:rPr>
+          <w:rFonts w:ascii="Calibri" w:eastAsia="Calibri" w:hAnsi="Calibri" w:cs="Calibri"/>
+          <w:b/>
+          <w:bCs/>
+          <w:sz w:val="21"/>
+          <w:szCs w:val="21"/>
+        </w:rPr>
+        <w:t xml:space="preserve">Rurality (one Census snapshot per nation; time-invariant control): </w:t>
+      </w:r>
+      <w:r>
+        <w:rPr>
+          <w:rFonts w:ascii="Calibri" w:eastAsia="Calibri" w:hAnsi="Calibri" w:cs="Calibri"/>
+          <w:sz w:val="21"/>
+          <w:szCs w:val="21"/>
+        </w:rPr>
+        <w:t xml:space="preserve">E&amp;W — ONS RUC 2021 (rural OAs, settlements &lt;10k); Scotland — URC 2022 (accessible + remote rural, &lt;3k): LA/council % × Census population = rural residents, summed to ITL2. NI — Settlement 2015 default rural (bands F–H, &lt;5k), Census 2011. Definitions differ — compare within nations or use nation effects (rural_definition column).</w:t>
+      </w:r>
+    </w:p>
+    <w:p>
+      <w:pPr>
+        <w:pStyle w:val="ListParagraph"/>
+        <w:numPr>
+          <w:ilvl w:val="0"/>
+          <w:numId w:val="1"/>
+        </w:numPr>
+        <w:spacing w:after="80"/>
+      </w:pPr>
+      <w:r>
+        <w:rPr>
+          <w:rFonts w:ascii="Calibri" w:eastAsia="Calibri" w:hAnsi="Calibri" w:cs="Calibri"/>
+          <w:b/>
+          <w:bCs/>
+          <w:sz w:val="21"/>
+          <w:szCs w:val="21"/>
+        </w:rPr>
+        <w:t xml:space="preserve">Population density: </w:t>
+      </w:r>
+      <w:r>
+        <w:rPr>
+          <w:rFonts w:ascii="Calibri" w:eastAsia="Calibri" w:hAnsi="Calibri" w:cs="Calibri"/>
+          <w:sz w:val="21"/>
+          <w:szCs w:val="21"/>
+        </w:rPr>
+        <w:t xml:space="preserve">population ÷ ONS land area (SAM, LAD December 2024), UK-wide, 1991–2025.</w:t>
+      </w:r>
+    </w:p>
+    <w:p>
+      <w:pPr>
+        <w:pStyle w:val="ListParagraph"/>
+        <w:numPr>
+          <w:ilvl w:val="0"/>
+          <w:numId w:val="1"/>
+        </w:numPr>
+        <w:spacing w:after="80"/>
+      </w:pPr>
+      <w:r>
+        <w:rPr>
+          <w:rFonts w:ascii="Calibri" w:eastAsia="Calibri" w:hAnsi="Calibri" w:cs="Calibri"/>
+          <w:b/>
+          <w:bCs/>
+          <w:sz w:val="21"/>
+          <w:szCs w:val="21"/>
+        </w:rPr>
+        <w:t xml:space="preserve">Population-weighted density: </w:t>
+      </w:r>
+      <w:r>
+        <w:rPr>
+          <w:rFonts w:ascii="Calibri" w:eastAsia="Calibri" w:hAnsi="Calibri" w:cs="Calibri"/>
+          <w:sz w:val="21"/>
+          <w:szCs w:val="21"/>
+        </w:rPr>
+        <w:t xml:space="preserve">density experienced by the average resident (Ciccone &amp; Hall; Glaeser &amp; Kahn) — Σ(p × d)/Σp over small areas: E&amp;W LSOAs and Scottish 2022 data zones (2011–2024), NI 2021 data zones (2021–2024). Small-area size differs by nation (~1,500 / ~750 / ~500 residents), so cross-border levels are approximate.</w:t>
+      </w:r>
+    </w:p>
+    <w:p>
+      <w:pPr>
+        <w:pStyle w:val="Heading2"/>
+        <w:spacing w:before="170" w:after="60"/>
+      </w:pPr>
+      <w:r>
+        <w:rPr>
+          <w:rFonts w:ascii="Calibri" w:eastAsia="Calibri" w:hAnsi="Calibri" w:cs="Calibri"/>
+          <w:b/>
+          <w:bCs/>
+          <w:color w:val="2E5496"/>
+          <w:sz w:val="22"/>
+          <w:szCs w:val="22"/>
+        </w:rPr>
+        <w:t xml:space="preserve">Job flows (secure business data)</w:t>
+      </w:r>
+    </w:p>
+    <w:p>
+      <w:pPr>
+        <w:pStyle w:val="ListParagraph"/>
+        <w:numPr>
+          <w:ilvl w:val="0"/>
+          <w:numId w:val="1"/>
+        </w:numPr>
+        <w:spacing w:after="80"/>
+      </w:pPr>
+      <w:r>
+        <w:rPr>
+          <w:rFonts w:ascii="Calibri" w:eastAsia="Calibri" w:hAnsi="Calibri" w:cs="Calibri"/>
+          <w:b/>
+          <w:bCs/>
+          <w:sz w:val="21"/>
+          <w:szCs w:val="21"/>
+        </w:rPr>
+        <w:t xml:space="preserve">Source: </w:t>
+      </w:r>
+      <w:r>
+        <w:rPr>
+          <w:rFonts w:ascii="Calibri" w:eastAsia="Calibri" w:hAnsi="Calibri" w:cs="Calibri"/>
+          <w:sz w:val="21"/>
+          <w:szCs w:val="21"/>
+        </w:rPr>
+        <w:t xml:space="preserve">ITL2 job creation / destruction file from the secure business data (clean/itl2_job_flows.csv, added by Will), 2000–2024, on ITL2 2021 (41 regions) — the reason for the 2021 versions (Section 1). Join on ITL221CD = itl2_code in clean/itl2_2021/.</w:t>
+      </w:r>
+    </w:p>
+    <w:p>
+      <w:pPr>
+        <w:pStyle w:val="ListParagraph"/>
+        <w:numPr>
+          <w:ilvl w:val="0"/>
+          <w:numId w:val="1"/>
+        </w:numPr>
+        <w:spacing w:after="80"/>
+      </w:pPr>
+      <w:r>
+        <w:rPr>
+          <w:rFonts w:ascii="Calibri" w:eastAsia="Calibri" w:hAnsi="Calibri" w:cs="Calibri"/>
+          <w:b/>
+          <w:bCs/>
+          <w:sz w:val="21"/>
+          <w:szCs w:val="21"/>
+        </w:rPr>
+        <w:t xml:space="preserve">Before use: </w:t>
+      </w:r>
+      <w:r>
+        <w:rPr>
+          <w:rFonts w:ascii="Calibri" w:eastAsia="Calibri" w:hAnsi="Calibri" w:cs="Calibri"/>
+          <w:sz w:val="21"/>
+          <w:szCs w:val="21"/>
+        </w:rPr>
+        <w:t xml:space="preserve">numbers are stored as text with thousands separators and Excel #N/A; net_emp_change appears twice; some “Unknown” region rows.</w:t>
+      </w:r>
+    </w:p>
+    <w:p>
+      <w:pPr>
         <w:pStyle w:val="Heading1"/>
         <w:spacing w:before="300" w:after="110"/>
       </w:pPr>
@@ -2425,6 +2943,34 @@
           <w:numId w:val="1"/>
         </w:numPr>
         <w:spacing w:after="80"/>
+      </w:pPr>
+      <w:r>
+        <w:rPr>
+          <w:rFonts w:ascii="Calibri" w:eastAsia="Calibri" w:hAnsi="Calibri" w:cs="Calibri"/>
+          <w:b/>
+          <w:bCs/>
+          <w:sz w:val="21"/>
+          <w:szCs w:val="21"/>
+        </w:rPr>
+        <w:t xml:space="preserve">Migration levels over time: </w:t>
+      </w:r>
+      <w:r>
+        <w:rPr>
+          <w:rFonts w:ascii="Calibri" w:eastAsia="Calibri" w:hAnsi="Calibri" w:cs="Calibri"/>
+          <w:sz w:val="21"/>
+          <w:szCs w:val="21"/>
+        </w:rPr>
+        <w:t xml:space="preserve">cross-region moves per 1,000 show national steps in 2017 (+11%), 2020 (−10%, COVID) and 2021 (+18%) — absorbed by year effects; cause of the 2017 step unconfirmed.</w:t>
+      </w:r>
+    </w:p>
+    <w:p>
+      <w:pPr>
+        <w:pStyle w:val="ListParagraph"/>
+        <w:numPr>
+          <w:ilvl w:val="0"/>
+          <w:numId w:val="1"/>
+        </w:numPr>
+        <w:spacing w:after="80"/>
         <w:rPr>
           <w:highlight w:val="yellow"/>
         </w:rPr>
@@ -2484,15 +3030,15 @@
           <w:sz w:val="21"/>
           <w:szCs w:val="21"/>
         </w:rPr>
-        <w:t xml:space="preserve">Scotland/NI migration gap </w:t>
-      </w:r>
-      <w:r>
-        <w:rPr>
-          <w:rFonts w:ascii="Calibri" w:eastAsia="Calibri" w:hAnsi="Calibri" w:cs="Calibri"/>
-          <w:sz w:val="21"/>
-          <w:szCs w:val="21"/>
-        </w:rPr>
-        <w:t>— accept England &amp; Wales–only, or stitch in NRS + NISRA (decision for Richard). English figures already capture cross-border flows.</w:t>
+        <w:t xml:space="preserve">Migration Scotland/NI — </w:t>
+      </w:r>
+      <w:r>
+        <w:rPr>
+          <w:rFonts w:ascii="Calibri" w:eastAsia="Calibri" w:hAnsi="Calibri" w:cs="Calibri"/>
+          <w:sz w:val="21"/>
+          <w:szCs w:val="21"/>
+        </w:rPr>
+        <w:t xml:space="preserve">resolved (Scotland from NRS, NI from the ONS matrix). Remaining gap: flows between a specific Scottish region and a specific E&amp;W region are not published.</w:t>
       </w:r>
     </w:p>
     <w:p>
@@ -2540,15 +3086,43 @@
           <w:sz w:val="21"/>
           <w:szCs w:val="21"/>
         </w:rPr>
-        <w:t xml:space="preserve">Migration notebook — </w:t>
-      </w:r>
-      <w:r>
-        <w:rPr>
-          <w:rFonts w:ascii="Calibri" w:eastAsia="Calibri" w:hAnsi="Calibri" w:cs="Calibri"/>
-          <w:sz w:val="21"/>
-          <w:szCs w:val="21"/>
-        </w:rPr>
-        <w:t xml:space="preserve">reads only the T1a sheets (to 2021); the committed 2012–2025 CSV was built outside it. Update before rerunning.</w:t>
+        <w:t xml:space="preserve">Job flows to ITL2 2025 — </w:t>
+      </w:r>
+      <w:r>
+        <w:rPr>
+          <w:rFonts w:ascii="Calibri" w:eastAsia="Calibri" w:hAnsi="Calibri" w:cs="Calibri"/>
+          <w:sz w:val="21"/>
+          <w:szCs w:val="21"/>
+        </w:rPr>
+        <w:t xml:space="preserve">re-aggregate the job-flows data to 2025 regions inside the secure environment (exact); the 2025 panel then becomes the main analysis panel.</w:t>
+      </w:r>
+    </w:p>
+    <w:p>
+      <w:pPr>
+        <w:pStyle w:val="ListParagraph"/>
+        <w:numPr>
+          <w:ilvl w:val="0"/>
+          <w:numId w:val="1"/>
+        </w:numPr>
+        <w:spacing w:after="80"/>
+      </w:pPr>
+      <w:r>
+        <w:rPr>
+          <w:rFonts w:ascii="Calibri" w:eastAsia="Calibri" w:hAnsi="Calibri" w:cs="Calibri"/>
+          <w:b/>
+          <w:bCs/>
+          <w:sz w:val="21"/>
+          <w:szCs w:val="21"/>
+        </w:rPr>
+        <w:t xml:space="preserve">APS microdata (Secure Lab) — </w:t>
+      </w:r>
+      <w:r>
+        <w:rPr>
+          <w:rFonts w:ascii="Calibri" w:eastAsia="Calibri" w:hAnsi="Calibri" w:cs="Calibri"/>
+          <w:sz w:val="21"/>
+          <w:szCs w:val="21"/>
+        </w:rPr>
+        <w:t xml:space="preserve">inactivity by reason, occupation mix and on-the-job search are too suppressed at LA level on Nomis to sum; build weighted ITL2 estimates from APS microdata (same Secure Lab access as the LBD).</w:t>
       </w:r>
     </w:p>
     <w:p>

</xml_diff>